<commit_message>
Fix group_categories2 for Group 10 and 22 (G3->G4), add Chinese translations to category standards
</commit_message>
<xml_diff>
--- a/category standards.docx
+++ b/category standards.docx
@@ -3,26 +3,15 @@
 <w:document xmlns:wpc="http://schemas.microsoft.com/office/word/2010/wordprocessingCanvas" xmlns:cx="http://schemas.microsoft.com/office/drawing/2014/chartex" xmlns:cx1="http://schemas.microsoft.com/office/drawing/2015/9/8/chartex" xmlns:cx2="http://schemas.microsoft.com/office/drawing/2015/10/21/chartex" xmlns:cx3="http://schemas.microsoft.com/office/drawing/2016/5/9/chartex" xmlns:cx4="http://schemas.microsoft.com/office/drawing/2016/5/10/chartex" xmlns:cx5="http://schemas.microsoft.com/office/drawing/2016/5/11/chartex" xmlns:cx6="http://schemas.microsoft.com/office/drawing/2016/5/12/chartex" xmlns:cx7="http://schemas.microsoft.com/office/drawing/2016/5/13/chartex" xmlns:cx8="http://schemas.microsoft.com/office/drawing/2016/5/14/chartex" xmlns:mc="http://schemas.openxmlformats.org/markup-compatibility/2006" xmlns:aink="http://schemas.microsoft.com/office/drawing/2016/ink" xmlns:am3d="http://schemas.microsoft.com/office/drawing/2017/model3d" xmlns:o="urn:schemas-microsoft-com:office:office" xmlns:oel="http://schemas.microsoft.com/office/2019/extlst" xmlns:r="http://schemas.openxmlformats.org/officeDocument/2006/relationships" xmlns:m="http://schemas.openxmlformats.org/officeDocument/2006/math" xmlns:v="urn:schemas-microsoft-com:vml" xmlns:wp14="http://schemas.microsoft.com/office/word/2010/wordprocessingDrawing" xmlns:wp="http://schemas.openxmlformats.org/drawingml/2006/wordprocessingDrawing" xmlns:w10="urn:schemas-microsoft-com:office:word" xmlns:w="http://schemas.openxmlformats.org/wordprocessingml/2006/main" xmlns:w14="http://schemas.microsoft.com/office/word/2010/wordml" xmlns:w15="http://schemas.microsoft.com/office/word/2012/wordml" xmlns:w16cex="http://schemas.microsoft.com/office/word/2018/wordml/cex" xmlns:w16cid="http://schemas.microsoft.com/office/word/2016/wordml/cid" xmlns:w16="http://schemas.microsoft.com/office/word/2018/wordml" xmlns:w16du="http://schemas.microsoft.com/office/word/2023/wordml/word16du" xmlns:w16sdtdh="http://schemas.microsoft.com/office/word/2020/wordml/sdtdatahash" xmlns:w16sdtfl="http://schemas.microsoft.com/office/word/2024/wordml/sdtformatlock" xmlns:w16se="http://schemas.microsoft.com/office/word/2015/wordml/symex" xmlns:wpg="http://schemas.microsoft.com/office/word/2010/wordprocessingGroup" xmlns:wpi="http://schemas.microsoft.com/office/word/2010/wordprocessingInk" xmlns:wne="http://schemas.microsoft.com/office/word/2006/wordml" xmlns:wps="http://schemas.microsoft.com/office/word/2010/wordprocessingShape" mc:Ignorable="w14 w15 w16se w16cid w16 w16cex w16sdtdh w16sdtfl w16du wp14">
   <w:body>
     <w:p>
-      <w:pPr>
-        <w:rPr>
-          <w:lang w:val="de-DE"/>
-        </w:rPr>
-      </w:pPr>
-      <w:r>
-        <w:rPr>
-          <w:rFonts w:hint="eastAsia"/>
-          <w:lang w:val="de-DE"/>
-        </w:rPr>
+      <w:r>
         <w:t>小组（Group）的分类标准：</w:t>
       </w:r>
     </w:p>
     <w:p>
       <w:pPr>
-        <w:pStyle w:val="a9"/>
-        <w:numPr>
-          <w:ilvl w:val="0"/>
-          <w:numId w:val="1"/>
-        </w:numPr>
+        <w:rPr>
+          <w:rFonts w:hint="eastAsia"/>
+        </w:rPr>
       </w:pPr>
       <w:r>
         <w:t>G1</w:t>
@@ -31,19 +20,17 @@
         <w:rPr>
           <w:rFonts w:hint="eastAsia"/>
         </w:rPr>
-        <w:t>：</w:t>
-      </w:r>
-      <w:r>
-        <w:t>Majority principle: Two members have the same choices; the third member adapts.</w:t>
+        <w:t>表示</w:t>
+      </w:r>
+      <w:r>
+        <w:t>Majority principle: Two members have the same preferences; the third member adapts.</w:t>
       </w:r>
     </w:p>
     <w:p>
       <w:pPr>
-        <w:pStyle w:val="a9"/>
-        <w:numPr>
-          <w:ilvl w:val="0"/>
-          <w:numId w:val="1"/>
-        </w:numPr>
+        <w:rPr>
+          <w:rFonts w:hint="eastAsia"/>
+        </w:rPr>
       </w:pPr>
       <w:r>
         <w:t>G2</w:t>
@@ -52,7 +39,7 @@
         <w:rPr>
           <w:rFonts w:hint="eastAsia"/>
         </w:rPr>
-        <w:t>：</w:t>
+        <w:t>表示</w:t>
       </w:r>
       <w:r>
         <w:t>Compromise: After negotiating, individuals agree on a solution in between their initial choices.</w:t>
@@ -60,11 +47,9 @@
     </w:p>
     <w:p>
       <w:pPr>
-        <w:pStyle w:val="a9"/>
-        <w:numPr>
-          <w:ilvl w:val="0"/>
-          <w:numId w:val="1"/>
-        </w:numPr>
+        <w:rPr>
+          <w:rFonts w:hint="eastAsia"/>
+        </w:rPr>
       </w:pPr>
       <w:r>
         <w:t>G3</w:t>
@@ -73,7 +58,7 @@
         <w:rPr>
           <w:rFonts w:hint="eastAsia"/>
         </w:rPr>
-        <w:t>：</w:t>
+        <w:t>表示</w:t>
       </w:r>
       <w:r>
         <w:t>Minority: The decision is made by a single individual, based on his lack of compliance or indifference of other group members.</w:t>
@@ -81,11 +66,9 @@
     </w:p>
     <w:p>
       <w:pPr>
-        <w:pStyle w:val="a9"/>
-        <w:numPr>
-          <w:ilvl w:val="0"/>
-          <w:numId w:val="1"/>
-        </w:numPr>
+        <w:rPr>
+          <w:rFonts w:hint="eastAsia"/>
+        </w:rPr>
       </w:pPr>
       <w:r>
         <w:t>G4</w:t>
@@ -94,34 +77,57 @@
         <w:rPr>
           <w:rFonts w:hint="eastAsia"/>
         </w:rPr>
-        <w:t>：</w:t>
+        <w:t>表示</w:t>
       </w:r>
       <w:r>
         <w:t>Unanimity: Within the first chat round, all individuals agree on or submit the same proposal.</w:t>
+      </w:r>
+    </w:p>
+    <w:p>
+      <w:r>
+        <w:rPr>
+          <w:rFonts w:hint="eastAsia"/>
+        </w:rPr>
+        <w:t>注：G</w:t>
+      </w:r>
+      <w:r>
+        <w:t>1,G2, G3, G4</w:t>
+      </w:r>
+      <w:r>
+        <w:rPr>
+          <w:rFonts w:hint="eastAsia"/>
+          <w:lang w:val="de-DE"/>
+        </w:rPr>
+        <w:t>分别赋值为</w:t>
+      </w:r>
+      <w:r>
+        <w:rPr>
+          <w:rFonts w:hint="eastAsia"/>
+        </w:rPr>
+        <w:t>1，2，3，4</w:t>
       </w:r>
     </w:p>
     <w:p/>
+    <w:p/>
     <w:p>
       <w:r>
-        <w:rPr>
-          <w:rFonts w:hint="eastAsia"/>
-        </w:rPr>
         <w:t>个体成员的分类标准：</w:t>
       </w:r>
     </w:p>
     <w:p>
       <w:pPr>
-        <w:pStyle w:val="a9"/>
-        <w:numPr>
-          <w:ilvl w:val="0"/>
-          <w:numId w:val="2"/>
-        </w:numPr>
+        <w:rPr>
+          <w:rFonts w:hint="eastAsia"/>
+        </w:rPr>
       </w:pPr>
       <w:r>
         <w:t>I1</w:t>
       </w:r>
       <w:r>
-        <w:t xml:space="preserve">: </w:t>
+        <w:rPr>
+          <w:rFonts w:hint="eastAsia"/>
+        </w:rPr>
+        <w:t>表示</w:t>
       </w:r>
       <w:r>
         <w:t>Indifference: The individual either refuses to participate in the discussion or expresses that he does not care.</w:t>
@@ -129,61 +135,56 @@
     </w:p>
     <w:p>
       <w:pPr>
-        <w:pStyle w:val="a9"/>
-        <w:numPr>
-          <w:ilvl w:val="0"/>
-          <w:numId w:val="2"/>
-        </w:numPr>
+        <w:rPr>
+          <w:rFonts w:hint="eastAsia"/>
+        </w:rPr>
       </w:pPr>
       <w:r>
         <w:t>I2</w:t>
       </w:r>
       <w:r>
-        <w:t xml:space="preserve">: </w:t>
-      </w:r>
-      <w:r>
-        <w:t>Willingness to adapt: The individual with differing preferences decides to adapt their differing decision.</w:t>
+        <w:rPr>
+          <w:rFonts w:hint="eastAsia"/>
+        </w:rPr>
+        <w:t>表示</w:t>
+      </w:r>
+      <w:r>
+        <w:t>Willingness to adapt: The individual with differing preferences decides to adapt either voluntarily or on request.</w:t>
       </w:r>
     </w:p>
     <w:p>
       <w:pPr>
-        <w:pStyle w:val="a9"/>
-        <w:numPr>
-          <w:ilvl w:val="0"/>
-          <w:numId w:val="2"/>
-        </w:numPr>
+        <w:rPr>
+          <w:rFonts w:hint="eastAsia"/>
+        </w:rPr>
       </w:pPr>
       <w:r>
         <w:t>I3</w:t>
       </w:r>
       <w:r>
-        <w:t xml:space="preserve">: </w:t>
-      </w:r>
-      <w:r>
-        <w:t xml:space="preserve">Demand to adapt: The individual explicitly prompts others to make a </w:t>
-      </w:r>
-      <w:proofErr w:type="gramStart"/>
-      <w:r>
-        <w:t>more risky</w:t>
-      </w:r>
-      <w:proofErr w:type="gramEnd"/>
-      <w:r>
-        <w:t>(-delayed) decision.</w:t>
+        <w:rPr>
+          <w:rFonts w:hint="eastAsia"/>
+        </w:rPr>
+        <w:t>表示</w:t>
+      </w:r>
+      <w:r>
+        <w:t>Demand to adapt: The individual explicitly prompts others to adapt their differing decision.</w:t>
       </w:r>
     </w:p>
     <w:p>
       <w:pPr>
-        <w:pStyle w:val="a9"/>
-        <w:numPr>
-          <w:ilvl w:val="0"/>
-          <w:numId w:val="2"/>
-        </w:numPr>
+        <w:rPr>
+          <w:rFonts w:hint="eastAsia"/>
+        </w:rPr>
       </w:pPr>
       <w:r>
         <w:t>I4</w:t>
       </w:r>
       <w:r>
-        <w:t xml:space="preserve">: </w:t>
+        <w:rPr>
+          <w:rFonts w:hint="eastAsia"/>
+        </w:rPr>
+        <w:t>表示</w:t>
       </w:r>
       <w:r>
         <w:t>Demand for risk (</w:t>
@@ -194,30 +195,23 @@
       </w:r>
       <w:proofErr w:type="spellEnd"/>
       <w:r>
-        <w:t xml:space="preserve"> risk): The individual explicitly prompts others to make a </w:t>
-      </w:r>
-      <w:proofErr w:type="gramStart"/>
-      <w:r>
-        <w:t>more risky</w:t>
-      </w:r>
-      <w:proofErr w:type="gramEnd"/>
-      <w:r>
-        <w:t>(-delayed) decision.</w:t>
+        <w:t xml:space="preserve"> risk): The individual explicitly prompts others to make a more risky(-delayed) decision.</w:t>
       </w:r>
     </w:p>
     <w:p>
       <w:pPr>
-        <w:pStyle w:val="a9"/>
-        <w:numPr>
-          <w:ilvl w:val="0"/>
-          <w:numId w:val="2"/>
-        </w:numPr>
+        <w:rPr>
+          <w:rFonts w:hint="eastAsia"/>
+        </w:rPr>
       </w:pPr>
       <w:r>
         <w:t>I5</w:t>
       </w:r>
       <w:r>
-        <w:t xml:space="preserve">: </w:t>
+        <w:rPr>
+          <w:rFonts w:hint="eastAsia"/>
+        </w:rPr>
+        <w:t>表示</w:t>
       </w:r>
       <w:r>
         <w:t>Acceptance of risk (delayed risk): The individual accepts and implements the demand for risk (delayed risk).</w:t>
@@ -225,17 +219,18 @@
     </w:p>
     <w:p>
       <w:pPr>
-        <w:pStyle w:val="a9"/>
-        <w:numPr>
-          <w:ilvl w:val="0"/>
-          <w:numId w:val="2"/>
-        </w:numPr>
+        <w:rPr>
+          <w:rFonts w:hint="eastAsia"/>
+        </w:rPr>
       </w:pPr>
       <w:r>
         <w:t>I6</w:t>
       </w:r>
       <w:r>
-        <w:t xml:space="preserve">: </w:t>
+        <w:rPr>
+          <w:rFonts w:hint="eastAsia"/>
+        </w:rPr>
+        <w:t>表示</w:t>
       </w:r>
       <w:r>
         <w:t>Demand for less delayed risk: The individual explicitly prompts others to make a less risky-delayed decision.</w:t>
@@ -243,11 +238,6 @@
     </w:p>
     <w:p>
       <w:pPr>
-        <w:pStyle w:val="a9"/>
-        <w:numPr>
-          <w:ilvl w:val="0"/>
-          <w:numId w:val="2"/>
-        </w:numPr>
         <w:rPr>
           <w:rFonts w:hint="eastAsia"/>
         </w:rPr>
@@ -256,10 +246,39 @@
         <w:t>I7</w:t>
       </w:r>
       <w:r>
-        <w:t xml:space="preserve">: </w:t>
+        <w:rPr>
+          <w:rFonts w:hint="eastAsia"/>
+        </w:rPr>
+        <w:t>表示</w:t>
       </w:r>
       <w:r>
         <w:t>Acceptance of more delayed risk: An individual accepts and implements the demand for more delayed risk.</w:t>
+      </w:r>
+    </w:p>
+    <w:p>
+      <w:pPr>
+        <w:rPr>
+          <w:lang w:val="de-DE"/>
+        </w:rPr>
+      </w:pPr>
+      <w:r>
+        <w:rPr>
+          <w:rFonts w:hint="eastAsia"/>
+        </w:rPr>
+        <w:t>注：</w:t>
+      </w:r>
+      <w:r>
+        <w:rPr>
+          <w:lang w:val="de-DE"/>
+        </w:rPr>
+        <w:t>I1, I2, I3, I4, I5, I6, I7</w:t>
+      </w:r>
+      <w:r>
+        <w:rPr>
+          <w:rFonts w:hint="eastAsia"/>
+          <w:lang w:val="de-DE"/>
+        </w:rPr>
+        <w:t>分别赋值1，2，3，4，5，6，7</w:t>
       </w:r>
     </w:p>
     <w:sectPr>

</xml_diff>